<commit_message>
feat: migrate data base
</commit_message>
<xml_diff>
--- a/docs/PropNest_Architecture_and_Implementation_Blueprint.docx
+++ b/docs/PropNest_Architecture_and_Implementation_Blueprint.docx
@@ -9145,7 +9145,7 @@
                 <w:color w:val="000000"/>
                 <w:sz w:val="17"/>
               </w:rPr>
-              <w:t>UserId BIGINT, Email, FullName, PhoneNumber, Status, CreatedAt</w:t>
+              <w:t>UserId BIGINT, Email, PasswordHash, SecurityStamp, FullName, PhoneNumber, Role, Status, CreatedAt, UpdatedAt</w:t>
             </w:r>
           </w:p>
         </w:tc>
@@ -9180,7 +9180,7 @@
                 <w:color w:val="000000"/>
                 <w:sz w:val="17"/>
               </w:rPr>
-              <w:t>PK UserId; UQ Email; do ASP.NET Core Identity map AppUser.</w:t>
+              <w:t>PK UserId; UQ Email; ApplicationUser kế thừa IdentityUser&lt;long&gt; do IdentityDbContext map.</w:t>
             </w:r>
           </w:p>
         </w:tc>
@@ -9215,7 +9215,7 @@
                 <w:color w:val="000000"/>
                 <w:sz w:val="17"/>
               </w:rPr>
-              <w:t>Người dùng và profile.</w:t>
+              <w:t>Xác thực, bảo mật mật khẩu và hồ sơ người dùng.</w:t>
             </w:r>
           </w:p>
         </w:tc>
@@ -9325,7 +9325,7 @@
                 <w:color w:val="000000"/>
                 <w:sz w:val="17"/>
               </w:rPr>
-              <w:t>Identity-managed tables; UQ role name; FK tới Users.</w:t>
+              <w:t>Identity-managed tables (AspNetRoles, AspNetUserRoles); FK tới Users.</w:t>
             </w:r>
           </w:p>
         </w:tc>
@@ -9360,7 +9360,7 @@
                 <w:color w:val="000000"/>
                 <w:sz w:val="17"/>
               </w:rPr>
-              <w:t>Seller, Moderator, Admin.</w:t>
+              <w:t>Quản lý phân quyền Seller, Moderator, Admin.</w:t>
             </w:r>
           </w:p>
         </w:tc>
@@ -9950,6 +9950,19 @@
       <w:pPr>
         <w:spacing w:after="40"/>
       </w:pPr>
+    </w:p>
+    <w:p>
+      <w:pPr>
+        <w:spacing w:after="100" w:line="269" w:lineRule="auto"/>
+      </w:pPr>
+      <w:r>
+        <w:rPr>
+          <w:rFonts w:ascii="Arial" w:hAnsi="Arial" w:eastAsia="Arial"/>
+          <w:color w:val="000000"/>
+          <w:sz w:val="22"/>
+        </w:rPr>
+        <w:t>Quyết định thiết kế Identity: Nhóm thống nhất tích hợp ASP.NET Core Identity theo trường phái Pragmatic Clean Architecture. Thực thể ApplicationUser ở tầng Domain kế thừa IdentityUser&lt;long&gt; (thông qua package nhẹ Microsoft.Extensions.Identity.Stores) để tận dụng toàn diện UserManager và RoleManager (mã hóa mật khẩu chuẩn PBKDF2, lockout, concurrency stamp). Tầng Infrastructure cấu hình PropNestDbContext kế thừa IdentityDbContext&lt;ApplicationUser, IdentityRole&lt;long&gt;, long&gt; và map bảng chính thành 'Users' với khóa chính 'UserId' để tương thích toàn vẹn với các khóa ngoại từ Listings và Wallets.</w:t>
+      </w:r>
     </w:p>
     <w:p>
       <w:pPr>
@@ -10484,8 +10497,14 @@
             <w:pPr>
               <w:spacing w:after="0" w:line="240" w:lineRule="auto"/>
             </w:pPr>
-            <w:r>
-              <w:t xml:space="preserve">HistoryId, ListingId, ActorUserId, ActionType, ActionDate, SnapshotJson, DeltasJson, Note</w:t>
+            <w:r/>
+            <w:r>
+              <w:rPr>
+                <w:rFonts w:ascii="Arial" w:hAnsi="Arial" w:eastAsia="Arial"/>
+                <w:color w:val="000000"/>
+                <w:sz w:val="17"/>
+              </w:rPr>
+              <w:t>HistoryId, ListingId, ActorUserId, ActionType, ActionDate, IsSnapshot, SnapshotDataJson, DeltaChangesJson, Note</w:t>
             </w:r>
           </w:p>
         </w:tc>
@@ -10548,8 +10567,14 @@
             <w:pPr>
               <w:spacing w:after="0" w:line="240" w:lineRule="auto"/>
             </w:pPr>
-            <w:r>
-              <w:t xml:space="preserve">Audit event; snapshot khi Create và DeltasJson chứa các thay đổi field với oldValue/newValue.</w:t>
+            <w:r/>
+            <w:r>
+              <w:rPr>
+                <w:rFonts w:ascii="Arial" w:hAnsi="Arial" w:eastAsia="Arial"/>
+                <w:color w:val="000000"/>
+                <w:sz w:val="17"/>
+              </w:rPr>
+              <w:t>Audit event và delta history.</w:t>
             </w:r>
           </w:p>
         </w:tc>
@@ -12886,7 +12911,89 @@
         <w:ind w:left="259"/>
       </w:pPr>
       <w:r>
-        <w:t xml:space="preserve">Load Listing with RowVersion-&gt; Authorize ownership-&gt; Validate request-&gt; Clone selected fields before update-&gt; Apply allowed change-&gt; DeltaEngine produces a List of typed deltas with FieldName, OldValue and NewValue-&gt; serialize to DeltasJson-&gt; Save Listing and ListingHistory in one transaction-&gt; If material fields changed after publish, set PendingModeration and publish ListingResubmitted</w:t>
+        <w:rPr>
+          <w:rFonts w:ascii="Consolas" w:hAnsi="Consolas" w:eastAsia="Consolas"/>
+          <w:color w:val="000000"/>
+          <w:sz w:val="19"/>
+        </w:rPr>
+        <w:t>Load Listing with RowVersion</w:t>
+      </w:r>
+      <w:r>
+        <w:br/>
+      </w:r>
+      <w:r>
+        <w:rPr>
+          <w:rFonts w:ascii="Consolas" w:hAnsi="Consolas" w:eastAsia="Consolas"/>
+          <w:color w:val="000000"/>
+          <w:sz w:val="19"/>
+        </w:rPr>
+        <w:t>-&gt; Authorize ownership</w:t>
+      </w:r>
+      <w:r>
+        <w:br/>
+      </w:r>
+      <w:r>
+        <w:rPr>
+          <w:rFonts w:ascii="Consolas" w:hAnsi="Consolas" w:eastAsia="Consolas"/>
+          <w:color w:val="000000"/>
+          <w:sz w:val="19"/>
+        </w:rPr>
+        <w:t>-&gt; Validate request</w:t>
+      </w:r>
+      <w:r>
+        <w:br/>
+      </w:r>
+      <w:r>
+        <w:rPr>
+          <w:rFonts w:ascii="Consolas" w:hAnsi="Consolas" w:eastAsia="Consolas"/>
+          <w:color w:val="000000"/>
+          <w:sz w:val="19"/>
+        </w:rPr>
+        <w:t>-&gt; Clone selected fields before update</w:t>
+      </w:r>
+      <w:r>
+        <w:br/>
+      </w:r>
+      <w:r>
+        <w:rPr>
+          <w:rFonts w:ascii="Consolas" w:hAnsi="Consolas" w:eastAsia="Consolas"/>
+          <w:color w:val="000000"/>
+          <w:sz w:val="19"/>
+        </w:rPr>
+        <w:t>-&gt; Apply allowed change</w:t>
+      </w:r>
+      <w:r>
+        <w:br/>
+      </w:r>
+      <w:r>
+        <w:rPr>
+          <w:rFonts w:ascii="Consolas" w:hAnsi="Consolas" w:eastAsia="Consolas"/>
+          <w:color w:val="000000"/>
+          <w:sz w:val="19"/>
+        </w:rPr>
+        <w:t>-&gt; DeltaEngine produces [{ field, oldValue, newValue }]</w:t>
+      </w:r>
+      <w:r>
+        <w:br/>
+      </w:r>
+      <w:r>
+        <w:rPr>
+          <w:rFonts w:ascii="Consolas" w:hAnsi="Consolas" w:eastAsia="Consolas"/>
+          <w:color w:val="000000"/>
+          <w:sz w:val="19"/>
+        </w:rPr>
+        <w:t>-&gt; Save Listing and ListingHistory in one transaction</w:t>
+      </w:r>
+      <w:r>
+        <w:br/>
+      </w:r>
+      <w:r>
+        <w:rPr>
+          <w:rFonts w:ascii="Consolas" w:hAnsi="Consolas" w:eastAsia="Consolas"/>
+          <w:color w:val="000000"/>
+          <w:sz w:val="19"/>
+        </w:rPr>
+        <w:t>-&gt; If material fields changed after publish, set PendingModeration and publish ListingResubmitted</w:t>
       </w:r>
     </w:p>
     <w:p>

</xml_diff>